<commit_message>
chore: add owner mailing address to inactive funnel drafts
</commit_message>
<xml_diff>
--- a/docs/Hierarchia Sales Funnel Operations Handoff.docx
+++ b/docs/Hierarchia Sales Funnel Operations Handoff.docx
@@ -197,13 +197,19 @@
     <w:p>
       <w:pPr/>
       <w:r>
-        <w:t>The owner has requested hirarchia@zamdevai.com as the funnel email address. It is not currently listed as an active Brevo sender, and its receiving mailbox has not been verified. Confirm the spelling, provision or verify receiving access, then verify the sender before replacing the working address. This email address does not replace the physical business mailing address needed for the footer.</w:t>
+        <w:t>The owner has requested hirarchia@zamdevai.com as the funnel email address. It is not currently listed as an active Brevo sender, and its receiving mailbox has not been verified. Confirm the spelling, provision or verify receiving access, then verify the sender before replacing the working address.</w:t>
       </w:r>
     </w:p>
     <w:p>
       <w:pPr/>
       <w:r>
-        <w:t>Before activation, obtain the owner-approved business mailing address, add it to every footer, verify sender and domain status, and review the final copy. Test the opt-in confirmation and unsubscribe flow with owned test addresses. Record the confirmation time and source, verify suppression and stop-on-reply behavior, and exclude existing customers and active pilots where the content is no longer relevant. Keep templates inactive until these checks pass.</w:t>
+        <w:t>The owner-supplied footer address is Street 8, PCSIR, Johar Town, Lahore 54000, Pakistan. It has been added to all five inactive drafts and read back from Brevo. This is the address supplied for publication, not an independent postal-delivery verification.</w:t>
+      </w:r>
+    </w:p>
+    <w:p>
+      <w:pPr/>
+      <w:r>
+        <w:t>Before activation, verify sender and domain status and review the final copy. Test the opt-in confirmation and unsubscribe flow with owned test addresses. Record the confirmation time and source, verify suppression and stop-on-reply behavior, and exclude existing customers and active pilots where the content is no longer relevant. Keep templates inactive until these checks pass.</w:t>
       </w:r>
     </w:p>
     <w:p>
@@ -934,7 +940,7 @@
         <w:t>node scripts/configure-funnel.mjs</w:t>
       </w:r>
       <w:r>
-        <w:t xml:space="preserve"> idempotently configures the dedicated lists, attributes and inactive templates using the local key. It does not enroll existing contacts or send messages. Do not run it after manually customizing templates without reviewing the generated copy: it updates those dedicated templates from </w:t>
+        <w:t xml:space="preserve"> idempotently configures the dedicated lists, attributes and inactive templates using the local key. It does not enroll existing contacts or send messages. It reuses existing templates without replacing their copy; </w:t>
       </w:r>
       <w:r>
         <w:rPr>
@@ -944,7 +950,31 @@
         <w:t>email-sequences.json</w:t>
       </w:r>
       <w:r>
-        <w:t>.</w:t>
+        <w:t xml:space="preserve"> supplies new templates only.</w:t>
+      </w:r>
+    </w:p>
+    <w:p>
+      <w:pPr/>
+      <w:r/>
+      <w:r>
+        <w:rPr>
+          <w:rFonts w:ascii="Consolas" w:hAnsi="Consolas"/>
+          <w:sz w:val="20"/>
+        </w:rPr>
+        <w:t>node scripts/update-funnel-address.mjs</w:t>
+      </w:r>
+      <w:r>
+        <w:t xml:space="preserve"> updates only the address line in the five known inactive templates, preserving their copy, sender, reply-to and unsubscribe placeholder. The address is read from the gitignored </w:t>
+      </w:r>
+      <w:r>
+        <w:rPr>
+          <w:rFonts w:ascii="Consolas" w:hAnsi="Consolas"/>
+          <w:sz w:val="20"/>
+        </w:rPr>
+        <w:t>.env.funnel.local</w:t>
+      </w:r>
+      <w:r>
+        <w:t xml:space="preserve"> file and was applied to IDs 13 through 17. It does not activate templates or change the Brevo billing/company address.</w:t>
       </w:r>
     </w:p>
     <w:p>
@@ -1046,7 +1076,7 @@
     <w:p>
       <w:pPr/>
       <w:r>
-        <w:t>Confirm data-retention practices and mailbox response ownership. Finalize the business address and opt-in/unsubscribe tests before email activation. Native nurture automation, calendar automation, visitor analytics, prospect research and LinkedIn scheduling are not configured.</w:t>
+        <w:t>Confirm data-retention practices and mailbox response ownership. The owner-supplied mailing address is now in the draft footers; sender verification and opt-in/unsubscribe tests remain required before email activation. Native nurture automation, calendar automation, visitor analytics, prospect research and LinkedIn scheduling are not configured.</w:t>
       </w:r>
     </w:p>
     <w:sectPr>

</xml_diff>